<commit_message>
Improve SEO audit product and preview delivery
</commit_message>
<xml_diff>
--- a/audits/akvarium-akvas-2026-03-22.docx
+++ b/audits/akvarium-akvas-2026-03-22.docx
@@ -229,7 +229,7 @@
                 <w:color w:val="102035"/>
                 <w:sz w:val="22"/>
               </w:rPr>
-              <w:t>Дата: 22.03.2026 14:12</w:t>
+              <w:t>Дата: 22.03.2026 14:58</w:t>
             </w:r>
           </w:p>
           <w:p>
@@ -581,7 +581,7 @@
                 <w:color w:val="102035"/>
                 <w:sz w:val="34"/>
               </w:rPr>
-              <w:t>512.3 ms</w:t>
+              <w:t>520.6 ms</w:t>
             </w:r>
           </w:p>
         </w:tc>
@@ -4756,6 +4756,339 @@
         </w:tc>
       </w:tr>
     </w:tbl>
+    <w:p>
+      <w:r>
+        <w:rPr>
+          <w:rFonts w:ascii="Arial" w:hAnsi="Arial"/>
+          <w:b/>
+          <w:color w:val="F28B34"/>
+          <w:sz w:val="19"/>
+        </w:rPr>
+        <w:t>СКРИНШОТЫ</w:t>
+      </w:r>
+    </w:p>
+    <w:p>
+      <w:pPr>
+        <w:spacing w:after="120"/>
+      </w:pPr>
+      <w:r>
+        <w:rPr>
+          <w:rFonts w:ascii="Arial" w:hAnsi="Arial"/>
+          <w:b/>
+          <w:color w:val="102035"/>
+          <w:sz w:val="40"/>
+        </w:rPr>
+        <w:t>Автоскриншоты ключевых страниц</w:t>
+      </w:r>
+    </w:p>
+    <w:p>
+      <w:pPr>
+        <w:spacing w:after="200" w:line="300" w:lineRule="auto"/>
+      </w:pPr>
+      <w:r>
+        <w:rPr>
+          <w:rFonts w:ascii="Arial" w:hAnsi="Arial"/>
+          <w:b w:val="0"/>
+          <w:color w:val="5D6B82"/>
+          <w:sz w:val="22"/>
+        </w:rPr>
+        <w:t>Эти изображения помогают быстро увидеть контекст: как выглядит главная, контакты, категория и карточка товара в момент аудита.</w:t>
+      </w:r>
+    </w:p>
+    <w:tbl>
+      <w:tblPr>
+        <w:tblW w:type="auto" w:w="0"/>
+        <w:jc w:val="center"/>
+        <w:tblLook w:firstColumn="1" w:firstRow="1" w:lastColumn="0" w:lastRow="0" w:noHBand="0" w:noVBand="1" w:val="04A0"/>
+        <w:tblBorders>
+          <w:top w:val="nil"/>
+          <w:left w:val="nil"/>
+          <w:bottom w:val="nil"/>
+          <w:right w:val="nil"/>
+          <w:insideH w:val="nil"/>
+          <w:insideV w:val="nil"/>
+        </w:tblBorders>
+      </w:tblPr>
+      <w:tblGrid>
+        <w:gridCol w:w="10092"/>
+      </w:tblGrid>
+      <w:tr>
+        <w:tc>
+          <w:tcPr>
+            <w:tcW w:type="dxa" w:w="10092"/>
+            <w:shd w:fill="F6F9FC"/>
+            <w:tcMar>
+              <w:top w:w="90" w:type="dxa"/>
+              <w:start w:w="110" w:type="dxa"/>
+              <w:bottom w:w="80" w:type="dxa"/>
+              <w:end w:w="110" w:type="dxa"/>
+            </w:tcMar>
+          </w:tcPr>
+          <w:p>
+            <w:r>
+              <w:rPr>
+                <w:rFonts w:ascii="Arial" w:hAnsi="Arial"/>
+                <w:b/>
+                <w:color w:val="102035"/>
+                <w:sz w:val="21"/>
+              </w:rPr>
+              <w:t>Главная  |  /</w:t>
+            </w:r>
+          </w:p>
+        </w:tc>
+      </w:tr>
+      <w:tr>
+        <w:tc>
+          <w:tcPr>
+            <w:tcW w:type="dxa" w:w="10092"/>
+            <w:shd w:fill="FFFFFF"/>
+            <w:tcMar>
+              <w:top w:w="110" w:type="dxa"/>
+              <w:start w:w="110" w:type="dxa"/>
+              <w:bottom w:w="110" w:type="dxa"/>
+              <w:end w:w="110" w:type="dxa"/>
+            </w:tcMar>
+          </w:tcPr>
+          <w:p>
+            <w:r>
+              <w:drawing>
+                <wp:inline xmlns:a="http://schemas.openxmlformats.org/drawingml/2006/main" xmlns:pic="http://schemas.openxmlformats.org/drawingml/2006/picture">
+                  <wp:extent cx="5715000" cy="3810000"/>
+                  <wp:docPr id="2" name="Picture 2"/>
+                  <wp:cNvGraphicFramePr>
+                    <a:graphicFrameLocks noChangeAspect="1"/>
+                  </wp:cNvGraphicFramePr>
+                  <a:graphic>
+                    <a:graphicData uri="http://schemas.openxmlformats.org/drawingml/2006/picture">
+                      <pic:pic>
+                        <pic:nvPicPr>
+                          <pic:cNvPr id="0" name="01-home.png"/>
+                          <pic:cNvPicPr/>
+                        </pic:nvPicPr>
+                        <pic:blipFill>
+                          <a:blip r:embed="rId12"/>
+                          <a:stretch>
+                            <a:fillRect/>
+                          </a:stretch>
+                        </pic:blipFill>
+                        <pic:spPr>
+                          <a:xfrm>
+                            <a:off x="0" y="0"/>
+                            <a:ext cx="5715000" cy="3810000"/>
+                          </a:xfrm>
+                          <a:prstGeom prst="rect"/>
+                        </pic:spPr>
+                      </pic:pic>
+                    </a:graphicData>
+                  </a:graphic>
+                </wp:inline>
+              </w:drawing>
+            </w:r>
+          </w:p>
+        </w:tc>
+      </w:tr>
+    </w:tbl>
+    <w:p>
+      <w:pPr>
+        <w:spacing w:after="80"/>
+      </w:pPr>
+    </w:p>
+    <w:tbl>
+      <w:tblPr>
+        <w:tblW w:type="auto" w:w="0"/>
+        <w:jc w:val="center"/>
+        <w:tblLook w:firstColumn="1" w:firstRow="1" w:lastColumn="0" w:lastRow="0" w:noHBand="0" w:noVBand="1" w:val="04A0"/>
+        <w:tblBorders>
+          <w:top w:val="nil"/>
+          <w:left w:val="nil"/>
+          <w:bottom w:val="nil"/>
+          <w:right w:val="nil"/>
+          <w:insideH w:val="nil"/>
+          <w:insideV w:val="nil"/>
+        </w:tblBorders>
+      </w:tblPr>
+      <w:tblGrid>
+        <w:gridCol w:w="10092"/>
+      </w:tblGrid>
+      <w:tr>
+        <w:tc>
+          <w:tcPr>
+            <w:tcW w:type="dxa" w:w="10092"/>
+            <w:shd w:fill="F6F9FC"/>
+            <w:tcMar>
+              <w:top w:w="90" w:type="dxa"/>
+              <w:start w:w="110" w:type="dxa"/>
+              <w:bottom w:w="80" w:type="dxa"/>
+              <w:end w:w="110" w:type="dxa"/>
+            </w:tcMar>
+          </w:tcPr>
+          <w:p>
+            <w:r>
+              <w:rPr>
+                <w:rFonts w:ascii="Arial" w:hAnsi="Arial"/>
+                <w:b/>
+                <w:color w:val="102035"/>
+                <w:sz w:val="21"/>
+              </w:rPr>
+              <w:t>Контакты  |  /contacts</w:t>
+            </w:r>
+          </w:p>
+        </w:tc>
+      </w:tr>
+      <w:tr>
+        <w:tc>
+          <w:tcPr>
+            <w:tcW w:type="dxa" w:w="10092"/>
+            <w:shd w:fill="FFFFFF"/>
+            <w:tcMar>
+              <w:top w:w="110" w:type="dxa"/>
+              <w:start w:w="110" w:type="dxa"/>
+              <w:bottom w:w="110" w:type="dxa"/>
+              <w:end w:w="110" w:type="dxa"/>
+            </w:tcMar>
+          </w:tcPr>
+          <w:p>
+            <w:r>
+              <w:drawing>
+                <wp:inline xmlns:a="http://schemas.openxmlformats.org/drawingml/2006/main" xmlns:pic="http://schemas.openxmlformats.org/drawingml/2006/picture">
+                  <wp:extent cx="5715000" cy="3810000"/>
+                  <wp:docPr id="3" name="Picture 3"/>
+                  <wp:cNvGraphicFramePr>
+                    <a:graphicFrameLocks noChangeAspect="1"/>
+                  </wp:cNvGraphicFramePr>
+                  <a:graphic>
+                    <a:graphicData uri="http://schemas.openxmlformats.org/drawingml/2006/picture">
+                      <pic:pic>
+                        <pic:nvPicPr>
+                          <pic:cNvPr id="0" name="02-contacts.png"/>
+                          <pic:cNvPicPr/>
+                        </pic:nvPicPr>
+                        <pic:blipFill>
+                          <a:blip r:embed="rId13"/>
+                          <a:stretch>
+                            <a:fillRect/>
+                          </a:stretch>
+                        </pic:blipFill>
+                        <pic:spPr>
+                          <a:xfrm>
+                            <a:off x="0" y="0"/>
+                            <a:ext cx="5715000" cy="3810000"/>
+                          </a:xfrm>
+                          <a:prstGeom prst="rect"/>
+                        </pic:spPr>
+                      </pic:pic>
+                    </a:graphicData>
+                  </a:graphic>
+                </wp:inline>
+              </w:drawing>
+            </w:r>
+          </w:p>
+        </w:tc>
+      </w:tr>
+    </w:tbl>
+    <w:p>
+      <w:pPr>
+        <w:spacing w:after="80"/>
+      </w:pPr>
+    </w:p>
+    <w:tbl>
+      <w:tblPr>
+        <w:tblW w:type="auto" w:w="0"/>
+        <w:jc w:val="center"/>
+        <w:tblLook w:firstColumn="1" w:firstRow="1" w:lastColumn="0" w:lastRow="0" w:noHBand="0" w:noVBand="1" w:val="04A0"/>
+        <w:tblBorders>
+          <w:top w:val="nil"/>
+          <w:left w:val="nil"/>
+          <w:bottom w:val="nil"/>
+          <w:right w:val="nil"/>
+          <w:insideH w:val="nil"/>
+          <w:insideV w:val="nil"/>
+        </w:tblBorders>
+      </w:tblPr>
+      <w:tblGrid>
+        <w:gridCol w:w="10092"/>
+      </w:tblGrid>
+      <w:tr>
+        <w:tc>
+          <w:tcPr>
+            <w:tcW w:type="dxa" w:w="10092"/>
+            <w:shd w:fill="F6F9FC"/>
+            <w:tcMar>
+              <w:top w:w="90" w:type="dxa"/>
+              <w:start w:w="110" w:type="dxa"/>
+              <w:bottom w:w="80" w:type="dxa"/>
+              <w:end w:w="110" w:type="dxa"/>
+            </w:tcMar>
+          </w:tcPr>
+          <w:p>
+            <w:r>
+              <w:rPr>
+                <w:rFonts w:ascii="Arial" w:hAnsi="Arial"/>
+                <w:b/>
+                <w:color w:val="102035"/>
+                <w:sz w:val="21"/>
+              </w:rPr>
+              <w:t>Товар  |  /aquanic-aq-500-vneshnij-kanistrovyj-filtr-500l-ch-dlya-presnyh-i-morsk…</w:t>
+            </w:r>
+          </w:p>
+        </w:tc>
+      </w:tr>
+      <w:tr>
+        <w:tc>
+          <w:tcPr>
+            <w:tcW w:type="dxa" w:w="10092"/>
+            <w:shd w:fill="FFFFFF"/>
+            <w:tcMar>
+              <w:top w:w="110" w:type="dxa"/>
+              <w:start w:w="110" w:type="dxa"/>
+              <w:bottom w:w="110" w:type="dxa"/>
+              <w:end w:w="110" w:type="dxa"/>
+            </w:tcMar>
+          </w:tcPr>
+          <w:p>
+            <w:r>
+              <w:drawing>
+                <wp:inline xmlns:a="http://schemas.openxmlformats.org/drawingml/2006/main" xmlns:pic="http://schemas.openxmlformats.org/drawingml/2006/picture">
+                  <wp:extent cx="5715000" cy="3810000"/>
+                  <wp:docPr id="4" name="Picture 4"/>
+                  <wp:cNvGraphicFramePr>
+                    <a:graphicFrameLocks noChangeAspect="1"/>
+                  </wp:cNvGraphicFramePr>
+                  <a:graphic>
+                    <a:graphicData uri="http://schemas.openxmlformats.org/drawingml/2006/picture">
+                      <pic:pic>
+                        <pic:nvPicPr>
+                          <pic:cNvPr id="0" name="03-aquanic-aq-500-vneshnij-kanistrovyj-filtr-500l-ch-dlya-presnyh-i-morskih-akvariumov.png"/>
+                          <pic:cNvPicPr/>
+                        </pic:nvPicPr>
+                        <pic:blipFill>
+                          <a:blip r:embed="rId14"/>
+                          <a:stretch>
+                            <a:fillRect/>
+                          </a:stretch>
+                        </pic:blipFill>
+                        <pic:spPr>
+                          <a:xfrm>
+                            <a:off x="0" y="0"/>
+                            <a:ext cx="5715000" cy="3810000"/>
+                          </a:xfrm>
+                          <a:prstGeom prst="rect"/>
+                        </pic:spPr>
+                      </pic:pic>
+                    </a:graphicData>
+                  </a:graphic>
+                </wp:inline>
+              </w:drawing>
+            </w:r>
+          </w:p>
+        </w:tc>
+      </w:tr>
+    </w:tbl>
+    <w:p>
+      <w:pPr>
+        <w:spacing w:after="80"/>
+      </w:pPr>
+    </w:p>
     <w:sectPr>
       <w:headerReference w:type="default" r:id="rId9"/>
       <w:footerReference w:type="default" r:id="rId10"/>

</xml_diff>